<commit_message>
Important Japanese last year reoprt 3, change
</commit_message>
<xml_diff>
--- a/TINA_SAZINA_NEED_TO_CHANGE.docx
+++ b/TINA_SAZINA_NEED_TO_CHANGE.docx
@@ -1130,6 +1130,26 @@
       <w:proofErr w:type="spellEnd"/>
       <w:r>
         <w:t xml:space="preserve"> = TRUE</w:t>
+      </w:r>
+      <w:r>
+        <w:t xml:space="preserve">, but you don’t need to do this for United States and </w:t>
+      </w:r>
+      <w:proofErr w:type="spellStart"/>
+      <w:r>
+        <w:t>NA_Canada</w:t>
+      </w:r>
+      <w:proofErr w:type="spellEnd"/>
+      <w:r>
+        <w:t>.</w:t>
+      </w:r>
+    </w:p>
+    <w:p/>
+    <w:p>
+      <w:r>
+        <w:t>Also &lt;6 change it to &lt;3</w:t>
+      </w:r>
+      <w:r>
+        <w:t xml:space="preserve"> for the last report year.</w:t>
       </w:r>
     </w:p>
     <w:sectPr>

</xml_diff>

<commit_message>
robustness no o for the ff, instead keep consistent with nans in the first row
</commit_message>
<xml_diff>
--- a/TINA_SAZINA_NEED_TO_CHANGE.docx
+++ b/TINA_SAZINA_NEED_TO_CHANGE.docx
@@ -1150,6 +1150,13 @@
       </w:r>
       <w:r>
         <w:t xml:space="preserve"> for the last report year.</w:t>
+      </w:r>
+    </w:p>
+    <w:p/>
+    <w:p/>
+    <w:p>
+      <w:r>
+        <w:t>Make sure the set to 0 for the first row in all the series is only for the CUM returns and not the alpha as this will affect the alpha, in the alpha we should just drop the first row</w:t>
       </w:r>
     </w:p>
     <w:sectPr>

</xml_diff>